<commit_message>
Add cover page and introduction to the chapters file
Write the introduction (the Hebrew short story, Keret's style, the two
stories and their shared theme, research questions, structure), add a
cover page, and add Holtzman (2005) to both reference lists.

Co-Authored-By: Claude Fable 5.1 <noreply@anthropic.com>
Claude-Session: https://claude.ai/code/session_012ZD2wAUBZdU4RRE8wFJx9h
</commit_message>
<xml_diff>
--- a/seminar/סמינריון-חלק-א-רשימת-מקורות-וראשי-פרקים.docx
+++ b/seminar/סמינריון-חלק-א-רשימת-מקורות-וראשי-פרקים.docx
@@ -69,7 +69,7 @@
           <w:szCs w:val="30"/>
           <w:rtl/>
         </w:rPr>
-        <w:t xml:space="preserve">דרכי התמודדות עם קשיים בסיפורים "האנשים החלולים" ו"מי כמונו יודע" מאת אתגר קרת</w:t>
+        <w:t xml:space="preserve">דרכי התמודדות עם קשיים בשני סיפורים קצרים מאת אתגר קרת: "האנשים החלולים" ו"מי כמונו יודע"</w:t>
       </w:r>
     </w:p>
     <w:p>
@@ -189,6 +189,43 @@
           <w:rtl/>
         </w:rPr>
         <w:t xml:space="preserve">רשימת מקורות</w:t>
+      </w:r>
+    </w:p>
+    <w:p>
+      <w:pPr>
+        <w:bidi/>
+        <w:spacing w:after="160" w:line="360"/>
+        <w:ind w:left="720" w:hanging="720"/>
+        <w:jc w:val="right"/>
+      </w:pPr>
+      <w:r>
+        <w:rPr>
+          <w:rFonts w:ascii="David" w:cs="David" w:eastAsia="David" w:hAnsi="David"/>
+          <w:sz w:val="24"/>
+          <w:szCs w:val="24"/>
+          <w:rtl/>
+        </w:rPr>
+        <w:t xml:space="preserve">הולצמן, א' (2005). </w:t>
+      </w:r>
+      <w:r>
+        <w:rPr>
+          <w:rFonts w:ascii="David" w:cs="David" w:eastAsia="David" w:hAnsi="David"/>
+          <w:i/>
+          <w:iCs/>
+          <w:sz w:val="24"/>
+          <w:szCs w:val="24"/>
+          <w:rtl/>
+        </w:rPr>
+        <w:t xml:space="preserve">מפת דרכים: סיפורת עברית כיום</w:t>
+      </w:r>
+      <w:r>
+        <w:rPr>
+          <w:rFonts w:ascii="David" w:cs="David" w:eastAsia="David" w:hAnsi="David"/>
+          <w:sz w:val="24"/>
+          <w:szCs w:val="24"/>
+          <w:rtl/>
+        </w:rPr>
+        <w:t xml:space="preserve">. הקיבוץ המאוחד.</w:t>
       </w:r>
     </w:p>
     <w:p>

</xml_diff>

<commit_message>
Add clickable full-text links to the article references
Turn every article URL in the reference lists into a hyperlink, add the
missing link for Katsman (2005), and point Cohen (2015) at the PDF.

Co-Authored-By: Claude Fable 5.1 <noreply@anthropic.com>
Claude-Session: https://claude.ai/code/session_012ZD2wAUBZdU4RRE8wFJx9h
</commit_message>
<xml_diff>
--- a/seminar/סמינריון-חלק-א-רשימת-מקורות-וראשי-פרקים.docx
+++ b/seminar/סמינריון-חלק-א-רשימת-מקורות-וראשי-פרקים.docx
@@ -262,8 +262,20 @@
           <w:szCs w:val="24"/>
           <w:rtl/>
         </w:rPr>
-        <w:t xml:space="preserve">, כג(41). https://kitvei-et.efshar.org.il/גיליונות/מפגש-41/</w:t>
-      </w:r>
+        <w:t xml:space="preserve">, כג(41). </w:t>
+      </w:r>
+      <w:hyperlink w:history="1" r:id="rId13ax2qo0r63betsh3k7c7">
+        <w:r>
+          <w:rPr>
+            <w:rFonts w:ascii="David" w:cs="David" w:eastAsia="David" w:hAnsi="David"/>
+            <w:color w:val="0563C1"/>
+            <w:sz w:val="24"/>
+            <w:szCs w:val="24"/>
+            <w:u w:val="single"/>
+          </w:rPr>
+          <w:t xml:space="preserve">https://kitvei-et.efshar.org.il/wp-content/uploads/Mifgash-41-05-בשני-צירים-אבל-הורים-ואחים-כהן.pdf</w:t>
+        </w:r>
+      </w:hyperlink>
     </w:p>
     <w:p>
       <w:pPr>
@@ -299,8 +311,20 @@
           <w:szCs w:val="24"/>
           <w:rtl/>
         </w:rPr>
-        <w:t xml:space="preserve">, ד, 20-41.</w:t>
-      </w:r>
+        <w:t xml:space="preserve">, ד, 20-41. </w:t>
+      </w:r>
+      <w:hyperlink w:history="1" r:id="rId3tbrco0e3gaqut_nxivpz">
+        <w:r>
+          <w:rPr>
+            <w:rFonts w:ascii="David" w:cs="David" w:eastAsia="David" w:hAnsi="David"/>
+            <w:color w:val="0563C1"/>
+            <w:sz w:val="24"/>
+            <w:szCs w:val="24"/>
+            <w:u w:val="single"/>
+          </w:rPr>
+          <w:t xml:space="preserve">https://library.osu.edu/projects/hebrew-lexicon/99995-files/99995095/99995095-004/99995095-004-020-041.pdf</w:t>
+        </w:r>
+      </w:hyperlink>
     </w:p>
     <w:p>
       <w:pPr>
@@ -406,8 +430,20 @@
           <w:sz w:val="24"/>
           <w:szCs w:val="24"/>
         </w:rPr>
-        <w:t xml:space="preserve">, 21-33. http://www.aajs.org.au/wp-content/uploads/2020/03/AJJSvol32_Abramovich_21-33.pdf</w:t>
-      </w:r>
+        <w:t xml:space="preserve">, 21-33. </w:t>
+      </w:r>
+      <w:hyperlink w:history="1" r:id="rIdmus7-bzjonusummhc2-ih">
+        <w:r>
+          <w:rPr>
+            <w:rFonts w:ascii="David" w:cs="David" w:eastAsia="David" w:hAnsi="David"/>
+            <w:color w:val="0563C1"/>
+            <w:sz w:val="24"/>
+            <w:szCs w:val="24"/>
+            <w:u w:val="single"/>
+          </w:rPr>
+          <w:t xml:space="preserve">http://www.aajs.org.au/wp-content/uploads/2020/03/AJJSvol32_Abramovich_21-33.pdf</w:t>
+        </w:r>
+      </w:hyperlink>
     </w:p>
     <w:p>
       <w:pPr>
@@ -472,8 +508,20 @@
           <w:sz w:val="24"/>
           <w:szCs w:val="24"/>
         </w:rPr>
-        <w:t xml:space="preserve">, Winter 2018. https://in.bgu.ac.il/en/heksherim/BGU%20Review%202018/Adia-Mendelson-Maoz-BGUR.pdf</w:t>
-      </w:r>
+        <w:t xml:space="preserve">, Winter 2018. </w:t>
+      </w:r>
+      <w:hyperlink w:history="1" r:id="rIdms79tjzawdyscwe8n2nwv">
+        <w:r>
+          <w:rPr>
+            <w:rFonts w:ascii="David" w:cs="David" w:eastAsia="David" w:hAnsi="David"/>
+            <w:color w:val="0563C1"/>
+            <w:sz w:val="24"/>
+            <w:szCs w:val="24"/>
+            <w:u w:val="single"/>
+          </w:rPr>
+          <w:t xml:space="preserve">https://in.bgu.ac.il/en/heksherim/BGU%20Review%202018/Adia-Mendelson-Maoz-BGUR.pdf</w:t>
+        </w:r>
+      </w:hyperlink>
     </w:p>
     <w:p>
       <w:pPr>
@@ -505,8 +553,20 @@
           <w:sz w:val="24"/>
           <w:szCs w:val="24"/>
         </w:rPr>
-        <w:t xml:space="preserve">(4), Article 137. https://doi.org/10.3390/h9040137</w:t>
-      </w:r>
+        <w:t xml:space="preserve">(4), Article 137. </w:t>
+      </w:r>
+      <w:hyperlink w:history="1" r:id="rIdlhizknzuwjo6rbgrhqavo">
+        <w:r>
+          <w:rPr>
+            <w:rFonts w:ascii="David" w:cs="David" w:eastAsia="David" w:hAnsi="David"/>
+            <w:color w:val="0563C1"/>
+            <w:sz w:val="24"/>
+            <w:szCs w:val="24"/>
+            <w:u w:val="single"/>
+          </w:rPr>
+          <w:t xml:space="preserve">https://doi.org/10.3390/h9040137</w:t>
+        </w:r>
+      </w:hyperlink>
     </w:p>
     <w:p>
       <w:pPr>
@@ -538,8 +598,20 @@
           <w:sz w:val="24"/>
           <w:szCs w:val="24"/>
         </w:rPr>
-        <w:t xml:space="preserve">(8), 681-714. https://doi.org/10.1080/074811899200731</w:t>
-      </w:r>
+        <w:t xml:space="preserve">(8), 681-714. </w:t>
+      </w:r>
+      <w:hyperlink w:history="1" r:id="rIdjta-vbuco4ydm_b_sw_zz">
+        <w:r>
+          <w:rPr>
+            <w:rFonts w:ascii="David" w:cs="David" w:eastAsia="David" w:hAnsi="David"/>
+            <w:color w:val="0563C1"/>
+            <w:sz w:val="24"/>
+            <w:szCs w:val="24"/>
+            <w:u w:val="single"/>
+          </w:rPr>
+          <w:t xml:space="preserve">https://doi.org/10.1080/074811899200731</w:t>
+        </w:r>
+      </w:hyperlink>
     </w:p>
     <w:p>
       <w:pPr>
@@ -571,8 +643,20 @@
           <w:sz w:val="24"/>
           <w:szCs w:val="24"/>
         </w:rPr>
-        <w:t xml:space="preserve">, Winter 2018. https://www.bgu.ac.il/media/zpjot1iw/yigal-schwartz-bgur.pdf</w:t>
-      </w:r>
+        <w:t xml:space="preserve">, Winter 2018. </w:t>
+      </w:r>
+      <w:hyperlink w:history="1" r:id="rIdg1j7r7lkvftqi0va1zo7c">
+        <w:r>
+          <w:rPr>
+            <w:rFonts w:ascii="David" w:cs="David" w:eastAsia="David" w:hAnsi="David"/>
+            <w:color w:val="0563C1"/>
+            <w:sz w:val="24"/>
+            <w:szCs w:val="24"/>
+            <w:u w:val="single"/>
+          </w:rPr>
+          <w:t xml:space="preserve">https://www.bgu.ac.il/media/zpjot1iw/yigal-schwartz-bgur.pdf</w:t>
+        </w:r>
+      </w:hyperlink>
     </w:p>
     <w:p>
       <w:r>

</xml_diff>

<commit_message>
Correct source attributions after reading the five full-text articles
Replace the wrongly attributed Schwartz article (the BGU Review PDF is
"A story or a bullet between the eyes" on repetition, not "Stam"),
rewrite the Katsman claims to his actual reading of "The Hollow People"
(harmony without order, the father's rhetoric of banality, the stolen
voice), fix the Omer-Sherman claim about Keret's vocal rather than silent
home, add page numbers for Cohen and for the story in the 1994 collection,
and update the outline, article list, presentation and README.

Co-Authored-By: Claude Fable 5.1 <noreply@anthropic.com>
Claude-Session: https://claude.ai/code/session_012ZD2wAUBZdU4RRE8wFJx9h
</commit_message>
<xml_diff>
--- a/seminar/סמינריון-חלק-א-רשימת-מקורות-וראשי-פרקים.docx
+++ b/seminar/סמינריון-חלק-א-רשימת-מקורות-וראשי-פרקים.docx
@@ -262,9 +262,9 @@
           <w:szCs w:val="24"/>
           <w:rtl/>
         </w:rPr>
-        <w:t xml:space="preserve">, כג(41). </w:t>
-      </w:r>
-      <w:hyperlink w:history="1" r:id="rId13ax2qo0r63betsh3k7c7">
+        <w:t xml:space="preserve">, כג(41), 97-130. </w:t>
+      </w:r>
+      <w:hyperlink w:history="1" r:id="rIdrliuliw_-yfqfwijkafjh">
         <w:r>
           <w:rPr>
             <w:rFonts w:ascii="David" w:cs="David" w:eastAsia="David" w:hAnsi="David"/>
@@ -291,7 +291,7 @@
           <w:szCs w:val="24"/>
           <w:rtl/>
         </w:rPr>
-        <w:t xml:space="preserve">קצמן, ר' (2005). געגועים למיתוס: אישיות, אתיקה ואידאולוגיה במיתופואסיס הפוסטמודרני של אתגר קרת. </w:t>
+        <w:t xml:space="preserve">כצמן, ר' (2005). געגועים למיתוס: אישיות, אתיקה ואידיאולוגיה במיתופואסיס הפוסטמודרני של אתגר קרת. </w:t>
       </w:r>
       <w:r>
         <w:rPr>
@@ -313,7 +313,7 @@
         </w:rPr>
         <w:t xml:space="preserve">, ד, 20-41. </w:t>
       </w:r>
-      <w:hyperlink w:history="1" r:id="rId3tbrco0e3gaqut_nxivpz">
+      <w:hyperlink w:history="1" r:id="rIdzoz-oruitjmhlgjaxjllg">
         <w:r>
           <w:rPr>
             <w:rFonts w:ascii="David" w:cs="David" w:eastAsia="David" w:hAnsi="David"/>
@@ -360,7 +360,7 @@
           <w:szCs w:val="24"/>
           <w:rtl/>
         </w:rPr>
-        <w:t xml:space="preserve">. זמורה-ביתן.</w:t>
+        <w:t xml:space="preserve"> (עמ' 16-17). זמורה-ביתן.</w:t>
       </w:r>
     </w:p>
     <w:p>
@@ -432,7 +432,7 @@
         </w:rPr>
         <w:t xml:space="preserve">, 21-33. </w:t>
       </w:r>
-      <w:hyperlink w:history="1" r:id="rIdmus7-bzjonusummhc2-ih">
+      <w:hyperlink w:history="1" r:id="rId1jkxunt-inch7kwcjqjgo">
         <w:r>
           <w:rPr>
             <w:rFonts w:ascii="David" w:cs="David" w:eastAsia="David" w:hAnsi="David"/>
@@ -508,9 +508,9 @@
           <w:sz w:val="24"/>
           <w:szCs w:val="24"/>
         </w:rPr>
-        <w:t xml:space="preserve">, Winter 2018. </w:t>
-      </w:r>
-      <w:hyperlink w:history="1" r:id="rIdms79tjzawdyscwe8n2nwv">
+        <w:t xml:space="preserve">, Winter 2018, 1-24. </w:t>
+      </w:r>
+      <w:hyperlink w:history="1" r:id="rIdpdqasyevz7rd8bi0sgf8t">
         <w:r>
           <w:rPr>
             <w:rFonts w:ascii="David" w:cs="David" w:eastAsia="David" w:hAnsi="David"/>
@@ -555,7 +555,7 @@
         </w:rPr>
         <w:t xml:space="preserve">(4), Article 137. </w:t>
       </w:r>
-      <w:hyperlink w:history="1" r:id="rIdlhizknzuwjo6rbgrhqavo">
+      <w:hyperlink w:history="1" r:id="rIdgc73b_8fu8_emld_a95bd">
         <w:r>
           <w:rPr>
             <w:rFonts w:ascii="David" w:cs="David" w:eastAsia="David" w:hAnsi="David"/>
@@ -600,7 +600,7 @@
         </w:rPr>
         <w:t xml:space="preserve">(8), 681-714. </w:t>
       </w:r>
-      <w:hyperlink w:history="1" r:id="rIdjta-vbuco4ydm_b_sw_zz">
+      <w:hyperlink w:history="1" r:id="rIdigbohvyqlcs_smoahwk9r">
         <w:r>
           <w:rPr>
             <w:rFonts w:ascii="David" w:cs="David" w:eastAsia="David" w:hAnsi="David"/>
@@ -625,7 +625,7 @@
           <w:sz w:val="24"/>
           <w:szCs w:val="24"/>
         </w:rPr>
-        <w:t xml:space="preserve">Schwartz, Y. (2018). Stam: The unbearable lightness of banality, or on the nature of Etgar Keret's humor. </w:t>
+        <w:t xml:space="preserve">Schwartz, Y. (2018). "A story or a bullet between the eyes": Etgar Keret: Repetitiveness, morality, and postmodernism. </w:t>
       </w:r>
       <w:r>
         <w:rPr>
@@ -643,9 +643,9 @@
           <w:sz w:val="24"/>
           <w:szCs w:val="24"/>
         </w:rPr>
-        <w:t xml:space="preserve">, Winter 2018. </w:t>
-      </w:r>
-      <w:hyperlink w:history="1" r:id="rIdg1j7r7lkvftqi0va1zo7c">
+        <w:t xml:space="preserve">, Winter 2018, 1-24. (Original work published 2017 in Hebrew Studies, 58, 425-443) </w:t>
+      </w:r>
+      <w:hyperlink w:history="1" r:id="rIdfmyxpwsb5jtwagbhcopfv">
         <w:r>
           <w:rPr>
             <w:rFonts w:ascii="David" w:cs="David" w:eastAsia="David" w:hAnsi="David"/>
@@ -987,7 +987,7 @@
           <w:szCs w:val="24"/>
           <w:rtl/>
         </w:rPr>
-        <w:t xml:space="preserve">1.4 הפואטיקה של קרת ככלי התמודדות: עולם פרטי בעל חוקים משלו (קצמן, 2005); המתים-החיים (Mendelson-Maoz, 2018); ההומור והמילה "סתם" (Schwartz, 2018).</w:t>
+        <w:t xml:space="preserve">1.4 הפואטיקה של קרת ככלי התמודדות: מיתוס כ"הרמוניה ללא סדר" והקול הגנוב (כצמן, 2005); המתים-החיים והגבריות החלשה (Mendelson-Maoz, 2018); חזרה מכנית ומוטציה נרטיבית (Schwartz, 2018).</w:t>
       </w:r>
     </w:p>
     <w:p>
@@ -1107,7 +1107,7 @@
           <w:szCs w:val="24"/>
           <w:rtl/>
         </w:rPr>
-        <w:t xml:space="preserve">2.6 מחיר ההתמודדות: "סתם, ממש סתם"; הבן שנעשה אחד מהאנשים החלולים.</w:t>
+        <w:t xml:space="preserve">2.6 מחיר ההתמודדות: "סתם, ממש סתם"; הקול הגנוב; הבן שנעשה אחד מהאנשים החלולים.</w:t>
       </w:r>
     </w:p>
     <w:p>
@@ -1244,7 +1244,7 @@
           <w:szCs w:val="24"/>
           <w:rtl/>
         </w:rPr>
-        <w:t xml:space="preserve">3.7 הסיום: הצוואר במקום השקיעה; ההומור והבנאלי כהתמודדות כנה.</w:t>
+        <w:t xml:space="preserve">3.7 הסיום: הצוואר במקום השקיעה; המוטציה שעוצרת את לולאת החזרות.</w:t>
       </w:r>
     </w:p>
     <w:p>

</xml_diff>

<commit_message>
Add the college logo to the cover pages and the title slide
Co-Authored-By: Claude Fable 5.1 <noreply@anthropic.com>
Claude-Session: https://claude.ai/code/session_012ZD2wAUBZdU4RRE8wFJx9h
</commit_message>
<xml_diff>
--- a/seminar/סמינריון-חלק-א-רשימת-מקורות-וראשי-פרקים.docx
+++ b/seminar/סמינריון-חלק-א-רשימת-מקורות-וראשי-פרקים.docx
@@ -4,8 +4,54 @@
   <w:body>
     <w:p>
       <w:pPr>
-        <w:bidi/>
-        <w:spacing w:after="200" w:before="1400" w:line="360"/>
+        <w:spacing w:after="240" w:before="500"/>
+        <w:jc w:val="center"/>
+      </w:pPr>
+      <w:r>
+        <w:drawing>
+          <wp:inline distT="0" distB="0" distL="0" distR="0">
+            <wp:extent cx="2286000" cy="1428750"/>
+            <wp:effectExtent t="0" r="0" b="0" l="0"/>
+            <wp:docPr id="1" name="" descr="" title=""/>
+            <wp:cNvGraphicFramePr>
+              <a:graphicFrameLocks xmlns:a="http://schemas.openxmlformats.org/drawingml/2006/main" noChangeAspect="1"/>
+            </wp:cNvGraphicFramePr>
+            <a:graphic xmlns:a="http://schemas.openxmlformats.org/drawingml/2006/main">
+              <a:graphicData uri="http://schemas.openxmlformats.org/drawingml/2006/picture">
+                <pic:pic xmlns:pic="http://schemas.openxmlformats.org/drawingml/2006/picture">
+                  <pic:nvPicPr>
+                    <pic:cNvPr id="0" name="" descr=""/>
+                    <pic:cNvPicPr>
+                      <a:picLocks noChangeAspect="1" noChangeArrowheads="1"/>
+                    </pic:cNvPicPr>
+                  </pic:nvPicPr>
+                  <pic:blipFill>
+                    <a:blip r:embed="rId7" cstate="none"/>
+                    <a:srcRect/>
+                    <a:stretch>
+                      <a:fillRect/>
+                    </a:stretch>
+                  </pic:blipFill>
+                  <pic:spPr bwMode="auto">
+                    <a:xfrm>
+                      <a:off x="0" y="0"/>
+                      <a:ext cx="2286000" cy="1428750"/>
+                    </a:xfrm>
+                    <a:prstGeom prst="rect">
+                      <a:avLst/>
+                    </a:prstGeom>
+                  </pic:spPr>
+                </pic:pic>
+              </a:graphicData>
+            </a:graphic>
+          </wp:inline>
+        </w:drawing>
+      </w:r>
+    </w:p>
+    <w:p>
+      <w:pPr>
+        <w:bidi/>
+        <w:spacing w:after="200" w:before="0" w:line="360"/>
         <w:jc w:val="center"/>
       </w:pPr>
       <w:r>
@@ -264,7 +310,7 @@
         </w:rPr>
         <w:t xml:space="preserve">, כג(41), 97-130. </w:t>
       </w:r>
-      <w:hyperlink w:history="1" r:id="rIdrliuliw_-yfqfwijkafjh">
+      <w:hyperlink w:history="1" r:id="rIdcovjirrvskogfagxovhkj">
         <w:r>
           <w:rPr>
             <w:rFonts w:ascii="David" w:cs="David" w:eastAsia="David" w:hAnsi="David"/>
@@ -313,7 +359,7 @@
         </w:rPr>
         <w:t xml:space="preserve">, ד, 20-41. </w:t>
       </w:r>
-      <w:hyperlink w:history="1" r:id="rIdzoz-oruitjmhlgjaxjllg">
+      <w:hyperlink w:history="1" r:id="rIdla4jlecqwnayjot3nhjkh">
         <w:r>
           <w:rPr>
             <w:rFonts w:ascii="David" w:cs="David" w:eastAsia="David" w:hAnsi="David"/>
@@ -432,7 +478,7 @@
         </w:rPr>
         <w:t xml:space="preserve">, 21-33. </w:t>
       </w:r>
-      <w:hyperlink w:history="1" r:id="rId1jkxunt-inch7kwcjqjgo">
+      <w:hyperlink w:history="1" r:id="rId2kmyyrgtlwq3infwfabk5">
         <w:r>
           <w:rPr>
             <w:rFonts w:ascii="David" w:cs="David" w:eastAsia="David" w:hAnsi="David"/>
@@ -510,7 +556,7 @@
         </w:rPr>
         <w:t xml:space="preserve">, Winter 2018, 1-24. </w:t>
       </w:r>
-      <w:hyperlink w:history="1" r:id="rIdpdqasyevz7rd8bi0sgf8t">
+      <w:hyperlink w:history="1" r:id="rIdtnmsnxctw84p2njch8j4p">
         <w:r>
           <w:rPr>
             <w:rFonts w:ascii="David" w:cs="David" w:eastAsia="David" w:hAnsi="David"/>
@@ -555,7 +601,7 @@
         </w:rPr>
         <w:t xml:space="preserve">(4), Article 137. </w:t>
       </w:r>
-      <w:hyperlink w:history="1" r:id="rIdgc73b_8fu8_emld_a95bd">
+      <w:hyperlink w:history="1" r:id="rIdcn-taoud_gkuzmq2l4m6q">
         <w:r>
           <w:rPr>
             <w:rFonts w:ascii="David" w:cs="David" w:eastAsia="David" w:hAnsi="David"/>
@@ -600,7 +646,7 @@
         </w:rPr>
         <w:t xml:space="preserve">(8), 681-714. </w:t>
       </w:r>
-      <w:hyperlink w:history="1" r:id="rIdigbohvyqlcs_smoahwk9r">
+      <w:hyperlink w:history="1" r:id="rIdr4gwtpey-lrjdc-gb-deb">
         <w:r>
           <w:rPr>
             <w:rFonts w:ascii="David" w:cs="David" w:eastAsia="David" w:hAnsi="David"/>
@@ -645,7 +691,7 @@
         </w:rPr>
         <w:t xml:space="preserve">, Winter 2018, 1-24. (Original work published 2017 in Hebrew Studies, 58, 425-443) </w:t>
       </w:r>
-      <w:hyperlink w:history="1" r:id="rIdfmyxpwsb5jtwagbhcopfv">
+      <w:hyperlink w:history="1" r:id="rIdkhgmd_y1ooybonw9yhkr2">
         <w:r>
           <w:rPr>
             <w:rFonts w:ascii="David" w:cs="David" w:eastAsia="David" w:hAnsi="David"/>

</xml_diff>

<commit_message>
Suppress spell-check marks in the Word files
Set noProof and the he-IL/en-US language pair on the document defaults
and on every text run so Word shows no red underlines.

Co-Authored-By: Claude Fable 5.1 <noreply@anthropic.com>
Claude-Session: https://claude.ai/code/session_012ZD2wAUBZdU4RRE8wFJx9h
</commit_message>
<xml_diff>
--- a/seminar/סמינריון-חלק-א-רשימת-מקורות-וראשי-פרקים.docx
+++ b/seminar/סמינריון-חלק-א-רשימת-מקורות-וראשי-פרקים.docx
@@ -59,9 +59,11 @@
           <w:rFonts w:ascii="David" w:cs="David" w:eastAsia="David" w:hAnsi="David"/>
           <w:b/>
           <w:bCs/>
+          <w:noProof/>
           <w:sz w:val="28"/>
           <w:szCs w:val="28"/>
           <w:rtl/>
+          <w:lang w:val="en-US" w:bidi="he-IL"/>
         </w:rPr>
         <w:t xml:space="preserve">המכללה האקדמית הערבית לחינוך בישראל, חיפה</w:t>
       </w:r>
@@ -75,9 +77,11 @@
       <w:r>
         <w:rPr>
           <w:rFonts w:ascii="David" w:cs="David" w:eastAsia="David" w:hAnsi="David"/>
+          <w:noProof/>
           <w:sz w:val="26"/>
           <w:szCs w:val="26"/>
           <w:rtl/>
+          <w:lang w:val="en-US" w:bidi="he-IL"/>
         </w:rPr>
         <w:t xml:space="preserve">סמינריון בסיפורת עברית מודרנית: הסיפור הקצר מאת אתגר קרת</w:t>
       </w:r>
@@ -93,9 +97,11 @@
           <w:rFonts w:ascii="David" w:cs="David" w:eastAsia="David" w:hAnsi="David"/>
           <w:b/>
           <w:bCs/>
+          <w:noProof/>
           <w:sz w:val="36"/>
           <w:szCs w:val="36"/>
           <w:rtl/>
+          <w:lang w:val="en-US" w:bidi="he-IL"/>
         </w:rPr>
         <w:t xml:space="preserve">"סתם קולות"</w:t>
       </w:r>
@@ -111,9 +117,11 @@
           <w:rFonts w:ascii="David" w:cs="David" w:eastAsia="David" w:hAnsi="David"/>
           <w:b/>
           <w:bCs/>
+          <w:noProof/>
           <w:sz w:val="30"/>
           <w:szCs w:val="30"/>
           <w:rtl/>
+          <w:lang w:val="en-US" w:bidi="he-IL"/>
         </w:rPr>
         <w:t xml:space="preserve">דרכי התמודדות עם קשיים בשני סיפורים קצרים מאת אתגר קרת: "האנשים החלולים" ו"מי כמונו יודע"</w:t>
       </w:r>
@@ -127,9 +135,11 @@
       <w:r>
         <w:rPr>
           <w:rFonts w:ascii="David" w:cs="David" w:eastAsia="David" w:hAnsi="David"/>
+          <w:noProof/>
           <w:sz w:val="26"/>
           <w:szCs w:val="26"/>
           <w:rtl/>
+          <w:lang w:val="en-US" w:bidi="he-IL"/>
         </w:rPr>
         <w:t xml:space="preserve">חלק א: רשימת מקורות וראשי פרקים</w:t>
       </w:r>
@@ -143,9 +153,11 @@
       <w:r>
         <w:rPr>
           <w:rFonts w:ascii="David" w:cs="David" w:eastAsia="David" w:hAnsi="David"/>
+          <w:noProof/>
           <w:sz w:val="26"/>
           <w:szCs w:val="26"/>
           <w:rtl/>
+          <w:lang w:val="en-US" w:bidi="he-IL"/>
         </w:rPr>
         <w:t xml:space="preserve">שם הקורס: סמינריון בסיפורת עברית מודרנית</w:t>
       </w:r>
@@ -159,9 +171,11 @@
       <w:r>
         <w:rPr>
           <w:rFonts w:ascii="David" w:cs="David" w:eastAsia="David" w:hAnsi="David"/>
+          <w:noProof/>
           <w:sz w:val="26"/>
           <w:szCs w:val="26"/>
           <w:rtl/>
+          <w:lang w:val="en-US" w:bidi="he-IL"/>
         </w:rPr>
         <w:t xml:space="preserve">שם המרצה: ד"ר ישראלה וייס</w:t>
       </w:r>
@@ -175,9 +189,11 @@
       <w:r>
         <w:rPr>
           <w:rFonts w:ascii="David" w:cs="David" w:eastAsia="David" w:hAnsi="David"/>
+          <w:noProof/>
           <w:sz w:val="26"/>
           <w:szCs w:val="26"/>
           <w:rtl/>
+          <w:lang w:val="en-US" w:bidi="he-IL"/>
         </w:rPr>
         <w:t xml:space="preserve">שם הסטודנט/ית: ____________________</w:t>
       </w:r>
@@ -191,9 +207,11 @@
       <w:r>
         <w:rPr>
           <w:rFonts w:ascii="David" w:cs="David" w:eastAsia="David" w:hAnsi="David"/>
+          <w:noProof/>
           <w:sz w:val="26"/>
           <w:szCs w:val="26"/>
           <w:rtl/>
+          <w:lang w:val="en-US" w:bidi="he-IL"/>
         </w:rPr>
         <w:t xml:space="preserve">ת"ז: ____________________</w:t>
       </w:r>
@@ -207,9 +225,11 @@
       <w:r>
         <w:rPr>
           <w:rFonts w:ascii="David" w:cs="David" w:eastAsia="David" w:hAnsi="David"/>
+          <w:noProof/>
           <w:sz w:val="26"/>
           <w:szCs w:val="26"/>
           <w:rtl/>
+          <w:lang w:val="en-US" w:bidi="he-IL"/>
         </w:rPr>
         <w:t xml:space="preserve">תאריך הגשה: ____________________</w:t>
       </w:r>
@@ -230,9 +250,11 @@
           <w:rFonts w:ascii="David" w:cs="David" w:eastAsia="David" w:hAnsi="David"/>
           <w:b/>
           <w:bCs/>
+          <w:noProof/>
           <w:sz w:val="30"/>
           <w:szCs w:val="30"/>
           <w:rtl/>
+          <w:lang w:val="en-US" w:bidi="he-IL"/>
         </w:rPr>
         <w:t xml:space="preserve">רשימת מקורות</w:t>
       </w:r>
@@ -247,9 +269,11 @@
       <w:r>
         <w:rPr>
           <w:rFonts w:ascii="David" w:cs="David" w:eastAsia="David" w:hAnsi="David"/>
-          <w:sz w:val="24"/>
-          <w:szCs w:val="24"/>
-          <w:rtl/>
+          <w:noProof/>
+          <w:sz w:val="24"/>
+          <w:szCs w:val="24"/>
+          <w:rtl/>
+          <w:lang w:val="en-US" w:bidi="he-IL"/>
         </w:rPr>
         <w:t xml:space="preserve">הולצמן, א' (2005). </w:t>
       </w:r>
@@ -258,18 +282,22 @@
           <w:rFonts w:ascii="David" w:cs="David" w:eastAsia="David" w:hAnsi="David"/>
           <w:i/>
           <w:iCs/>
-          <w:sz w:val="24"/>
-          <w:szCs w:val="24"/>
-          <w:rtl/>
+          <w:noProof/>
+          <w:sz w:val="24"/>
+          <w:szCs w:val="24"/>
+          <w:rtl/>
+          <w:lang w:val="en-US" w:bidi="he-IL"/>
         </w:rPr>
         <w:t xml:space="preserve">מפת דרכים: סיפורת עברית כיום</w:t>
       </w:r>
       <w:r>
         <w:rPr>
           <w:rFonts w:ascii="David" w:cs="David" w:eastAsia="David" w:hAnsi="David"/>
-          <w:sz w:val="24"/>
-          <w:szCs w:val="24"/>
-          <w:rtl/>
+          <w:noProof/>
+          <w:sz w:val="24"/>
+          <w:szCs w:val="24"/>
+          <w:rtl/>
+          <w:lang w:val="en-US" w:bidi="he-IL"/>
         </w:rPr>
         <w:t xml:space="preserve">. הקיבוץ המאוחד.</w:t>
       </w:r>
@@ -284,9 +312,11 @@
       <w:r>
         <w:rPr>
           <w:rFonts w:ascii="David" w:cs="David" w:eastAsia="David" w:hAnsi="David"/>
-          <w:sz w:val="24"/>
-          <w:szCs w:val="24"/>
-          <w:rtl/>
+          <w:noProof/>
+          <w:sz w:val="24"/>
+          <w:szCs w:val="24"/>
+          <w:rtl/>
+          <w:lang w:val="en-US" w:bidi="he-IL"/>
         </w:rPr>
         <w:t xml:space="preserve">כהן, ד' (2015). בשני צירים שונים: תהליך האבל והתקשורת של הורים ואחים שכולים לאחר אבדן ילד בוגר. </w:t>
       </w:r>
@@ -295,25 +325,30 @@
           <w:rFonts w:ascii="David" w:cs="David" w:eastAsia="David" w:hAnsi="David"/>
           <w:i/>
           <w:iCs/>
-          <w:sz w:val="24"/>
-          <w:szCs w:val="24"/>
-          <w:rtl/>
+          <w:noProof/>
+          <w:sz w:val="24"/>
+          <w:szCs w:val="24"/>
+          <w:rtl/>
+          <w:lang w:val="en-US" w:bidi="he-IL"/>
         </w:rPr>
         <w:t xml:space="preserve">מפגש לעבודה חינוכית-סוציאלית</w:t>
       </w:r>
       <w:r>
         <w:rPr>
           <w:rFonts w:ascii="David" w:cs="David" w:eastAsia="David" w:hAnsi="David"/>
-          <w:sz w:val="24"/>
-          <w:szCs w:val="24"/>
-          <w:rtl/>
+          <w:noProof/>
+          <w:sz w:val="24"/>
+          <w:szCs w:val="24"/>
+          <w:rtl/>
+          <w:lang w:val="en-US" w:bidi="he-IL"/>
         </w:rPr>
         <w:t xml:space="preserve">, כג(41), 97-130. </w:t>
       </w:r>
-      <w:hyperlink w:history="1" r:id="rIdcovjirrvskogfagxovhkj">
+      <w:hyperlink w:history="1" r:id="rIdurejegw9z0os9l1uucugo">
         <w:r>
           <w:rPr>
             <w:rFonts w:ascii="David" w:cs="David" w:eastAsia="David" w:hAnsi="David"/>
+            <w:noProof/>
             <w:color w:val="0563C1"/>
             <w:sz w:val="24"/>
             <w:szCs w:val="24"/>
@@ -333,9 +368,11 @@
       <w:r>
         <w:rPr>
           <w:rFonts w:ascii="David" w:cs="David" w:eastAsia="David" w:hAnsi="David"/>
-          <w:sz w:val="24"/>
-          <w:szCs w:val="24"/>
-          <w:rtl/>
+          <w:noProof/>
+          <w:sz w:val="24"/>
+          <w:szCs w:val="24"/>
+          <w:rtl/>
+          <w:lang w:val="en-US" w:bidi="he-IL"/>
         </w:rPr>
         <w:t xml:space="preserve">כצמן, ר' (2005). געגועים למיתוס: אישיות, אתיקה ואידיאולוגיה במיתופואסיס הפוסטמודרני של אתגר קרת. </w:t>
       </w:r>
@@ -344,25 +381,30 @@
           <w:rFonts w:ascii="David" w:cs="David" w:eastAsia="David" w:hAnsi="David"/>
           <w:i/>
           <w:iCs/>
-          <w:sz w:val="24"/>
-          <w:szCs w:val="24"/>
-          <w:rtl/>
+          <w:noProof/>
+          <w:sz w:val="24"/>
+          <w:szCs w:val="24"/>
+          <w:rtl/>
+          <w:lang w:val="en-US" w:bidi="he-IL"/>
         </w:rPr>
         <w:t xml:space="preserve">מכאן</w:t>
       </w:r>
       <w:r>
         <w:rPr>
           <w:rFonts w:ascii="David" w:cs="David" w:eastAsia="David" w:hAnsi="David"/>
-          <w:sz w:val="24"/>
-          <w:szCs w:val="24"/>
-          <w:rtl/>
+          <w:noProof/>
+          <w:sz w:val="24"/>
+          <w:szCs w:val="24"/>
+          <w:rtl/>
+          <w:lang w:val="en-US" w:bidi="he-IL"/>
         </w:rPr>
         <w:t xml:space="preserve">, ד, 20-41. </w:t>
       </w:r>
-      <w:hyperlink w:history="1" r:id="rIdla4jlecqwnayjot3nhjkh">
+      <w:hyperlink w:history="1" r:id="rIdenfgff6qovfw1k0jyy5ij">
         <w:r>
           <w:rPr>
             <w:rFonts w:ascii="David" w:cs="David" w:eastAsia="David" w:hAnsi="David"/>
+            <w:noProof/>
             <w:color w:val="0563C1"/>
             <w:sz w:val="24"/>
             <w:szCs w:val="24"/>
@@ -382,9 +424,11 @@
       <w:r>
         <w:rPr>
           <w:rFonts w:ascii="David" w:cs="David" w:eastAsia="David" w:hAnsi="David"/>
-          <w:sz w:val="24"/>
-          <w:szCs w:val="24"/>
-          <w:rtl/>
+          <w:noProof/>
+          <w:sz w:val="24"/>
+          <w:szCs w:val="24"/>
+          <w:rtl/>
+          <w:lang w:val="en-US" w:bidi="he-IL"/>
         </w:rPr>
         <w:t xml:space="preserve">קרת, א' (1994). האנשים החלולים. בתוך </w:t>
       </w:r>
@@ -393,18 +437,22 @@
           <w:rFonts w:ascii="David" w:cs="David" w:eastAsia="David" w:hAnsi="David"/>
           <w:i/>
           <w:iCs/>
-          <w:sz w:val="24"/>
-          <w:szCs w:val="24"/>
-          <w:rtl/>
+          <w:noProof/>
+          <w:sz w:val="24"/>
+          <w:szCs w:val="24"/>
+          <w:rtl/>
+          <w:lang w:val="en-US" w:bidi="he-IL"/>
         </w:rPr>
         <w:t xml:space="preserve">געגועי לקיסינג'ר</w:t>
       </w:r>
       <w:r>
         <w:rPr>
           <w:rFonts w:ascii="David" w:cs="David" w:eastAsia="David" w:hAnsi="David"/>
-          <w:sz w:val="24"/>
-          <w:szCs w:val="24"/>
-          <w:rtl/>
+          <w:noProof/>
+          <w:sz w:val="24"/>
+          <w:szCs w:val="24"/>
+          <w:rtl/>
+          <w:lang w:val="en-US" w:bidi="he-IL"/>
         </w:rPr>
         <w:t xml:space="preserve"> (עמ' 16-17). זמורה-ביתן.</w:t>
       </w:r>
@@ -419,9 +467,11 @@
       <w:r>
         <w:rPr>
           <w:rFonts w:ascii="David" w:cs="David" w:eastAsia="David" w:hAnsi="David"/>
-          <w:sz w:val="24"/>
-          <w:szCs w:val="24"/>
-          <w:rtl/>
+          <w:noProof/>
+          <w:sz w:val="24"/>
+          <w:szCs w:val="24"/>
+          <w:rtl/>
+          <w:lang w:val="en-US" w:bidi="he-IL"/>
         </w:rPr>
         <w:t xml:space="preserve">קרת, א' (2024). מי כמונו יודע. בתוך </w:t>
       </w:r>
@@ -430,18 +480,22 @@
           <w:rFonts w:ascii="David" w:cs="David" w:eastAsia="David" w:hAnsi="David"/>
           <w:i/>
           <w:iCs/>
-          <w:sz w:val="24"/>
-          <w:szCs w:val="24"/>
-          <w:rtl/>
+          <w:noProof/>
+          <w:sz w:val="24"/>
+          <w:szCs w:val="24"/>
+          <w:rtl/>
+          <w:lang w:val="en-US" w:bidi="he-IL"/>
         </w:rPr>
         <w:t xml:space="preserve">אוטוקורקט</w:t>
       </w:r>
       <w:r>
         <w:rPr>
           <w:rFonts w:ascii="David" w:cs="David" w:eastAsia="David" w:hAnsi="David"/>
-          <w:sz w:val="24"/>
-          <w:szCs w:val="24"/>
-          <w:rtl/>
+          <w:noProof/>
+          <w:sz w:val="24"/>
+          <w:szCs w:val="24"/>
+          <w:rtl/>
+          <w:lang w:val="en-US" w:bidi="he-IL"/>
         </w:rPr>
         <w:t xml:space="preserve">. כנרת, זמורה-ביתן, דביר.</w:t>
       </w:r>
@@ -455,8 +509,10 @@
       <w:r>
         <w:rPr>
           <w:rFonts w:ascii="David" w:cs="David" w:eastAsia="David" w:hAnsi="David"/>
-          <w:sz w:val="24"/>
-          <w:szCs w:val="24"/>
+          <w:noProof/>
+          <w:sz w:val="24"/>
+          <w:szCs w:val="24"/>
+          <w:lang w:val="en-US" w:bidi="he-IL"/>
         </w:rPr>
         <w:t xml:space="preserve">Abramovich, D. (2019). Israeli Holocaust memory in a short story by Etgar Keret. </w:t>
       </w:r>
@@ -465,23 +521,28 @@
           <w:rFonts w:ascii="David" w:cs="David" w:eastAsia="David" w:hAnsi="David"/>
           <w:i/>
           <w:iCs/>
-          <w:sz w:val="24"/>
-          <w:szCs w:val="24"/>
+          <w:noProof/>
+          <w:sz w:val="24"/>
+          <w:szCs w:val="24"/>
+          <w:lang w:val="en-US" w:bidi="he-IL"/>
         </w:rPr>
         <w:t xml:space="preserve">Australian Journal of Jewish Studies, 32</w:t>
       </w:r>
       <w:r>
         <w:rPr>
           <w:rFonts w:ascii="David" w:cs="David" w:eastAsia="David" w:hAnsi="David"/>
-          <w:sz w:val="24"/>
-          <w:szCs w:val="24"/>
+          <w:noProof/>
+          <w:sz w:val="24"/>
+          <w:szCs w:val="24"/>
+          <w:lang w:val="en-US" w:bidi="he-IL"/>
         </w:rPr>
         <w:t xml:space="preserve">, 21-33. </w:t>
       </w:r>
-      <w:hyperlink w:history="1" r:id="rId2kmyyrgtlwq3infwfabk5">
+      <w:hyperlink w:history="1" r:id="rIddvr1x_r9hz_3lumai9g9t">
         <w:r>
           <w:rPr>
             <w:rFonts w:ascii="David" w:cs="David" w:eastAsia="David" w:hAnsi="David"/>
+            <w:noProof/>
             <w:color w:val="0563C1"/>
             <w:sz w:val="24"/>
             <w:szCs w:val="24"/>
@@ -500,8 +561,10 @@
       <w:r>
         <w:rPr>
           <w:rFonts w:ascii="David" w:cs="David" w:eastAsia="David" w:hAnsi="David"/>
-          <w:sz w:val="24"/>
-          <w:szCs w:val="24"/>
+          <w:noProof/>
+          <w:sz w:val="24"/>
+          <w:szCs w:val="24"/>
+          <w:lang w:val="en-US" w:bidi="he-IL"/>
         </w:rPr>
         <w:t xml:space="preserve">Lazarus, R. S., &amp; Folkman, S. (1984). </w:t>
       </w:r>
@@ -510,16 +573,20 @@
           <w:rFonts w:ascii="David" w:cs="David" w:eastAsia="David" w:hAnsi="David"/>
           <w:i/>
           <w:iCs/>
-          <w:sz w:val="24"/>
-          <w:szCs w:val="24"/>
+          <w:noProof/>
+          <w:sz w:val="24"/>
+          <w:szCs w:val="24"/>
+          <w:lang w:val="en-US" w:bidi="he-IL"/>
         </w:rPr>
         <w:t xml:space="preserve">Stress, appraisal, and coping</w:t>
       </w:r>
       <w:r>
         <w:rPr>
           <w:rFonts w:ascii="David" w:cs="David" w:eastAsia="David" w:hAnsi="David"/>
-          <w:sz w:val="24"/>
-          <w:szCs w:val="24"/>
+          <w:noProof/>
+          <w:sz w:val="24"/>
+          <w:szCs w:val="24"/>
+          <w:lang w:val="en-US" w:bidi="he-IL"/>
         </w:rPr>
         <w:t xml:space="preserve">. Springer.</w:t>
       </w:r>
@@ -533,8 +600,10 @@
       <w:r>
         <w:rPr>
           <w:rFonts w:ascii="David" w:cs="David" w:eastAsia="David" w:hAnsi="David"/>
-          <w:sz w:val="24"/>
-          <w:szCs w:val="24"/>
+          <w:noProof/>
+          <w:sz w:val="24"/>
+          <w:szCs w:val="24"/>
+          <w:lang w:val="en-US" w:bidi="he-IL"/>
         </w:rPr>
         <w:t xml:space="preserve">Mendelson-Maoz, A. (2018). Keret's "living-dead" and the sacrifice of Israeli masculinity. </w:t>
       </w:r>
@@ -543,23 +612,28 @@
           <w:rFonts w:ascii="David" w:cs="David" w:eastAsia="David" w:hAnsi="David"/>
           <w:i/>
           <w:iCs/>
-          <w:sz w:val="24"/>
-          <w:szCs w:val="24"/>
+          <w:noProof/>
+          <w:sz w:val="24"/>
+          <w:szCs w:val="24"/>
+          <w:lang w:val="en-US" w:bidi="he-IL"/>
         </w:rPr>
         <w:t xml:space="preserve">BGU Review: A Journal of Israeli Culture</w:t>
       </w:r>
       <w:r>
         <w:rPr>
           <w:rFonts w:ascii="David" w:cs="David" w:eastAsia="David" w:hAnsi="David"/>
-          <w:sz w:val="24"/>
-          <w:szCs w:val="24"/>
+          <w:noProof/>
+          <w:sz w:val="24"/>
+          <w:szCs w:val="24"/>
+          <w:lang w:val="en-US" w:bidi="he-IL"/>
         </w:rPr>
         <w:t xml:space="preserve">, Winter 2018, 1-24. </w:t>
       </w:r>
-      <w:hyperlink w:history="1" r:id="rIdtnmsnxctw84p2njch8j4p">
+      <w:hyperlink w:history="1" r:id="rId5yb4m5u94lcbdzhzvfwyj">
         <w:r>
           <w:rPr>
             <w:rFonts w:ascii="David" w:cs="David" w:eastAsia="David" w:hAnsi="David"/>
+            <w:noProof/>
             <w:color w:val="0563C1"/>
             <w:sz w:val="24"/>
             <w:szCs w:val="24"/>
@@ -578,8 +652,10 @@
       <w:r>
         <w:rPr>
           <w:rFonts w:ascii="David" w:cs="David" w:eastAsia="David" w:hAnsi="David"/>
-          <w:sz w:val="24"/>
-          <w:szCs w:val="24"/>
+          <w:noProof/>
+          <w:sz w:val="24"/>
+          <w:szCs w:val="24"/>
+          <w:lang w:val="en-US" w:bidi="he-IL"/>
         </w:rPr>
         <w:t xml:space="preserve">Omer-Sherman, R. (2020). "To extract from it some sort of beautiful thing": The Holocaust in the families and fiction of Nava Semel and Etgar Keret. </w:t>
       </w:r>
@@ -588,23 +664,28 @@
           <w:rFonts w:ascii="David" w:cs="David" w:eastAsia="David" w:hAnsi="David"/>
           <w:i/>
           <w:iCs/>
-          <w:sz w:val="24"/>
-          <w:szCs w:val="24"/>
+          <w:noProof/>
+          <w:sz w:val="24"/>
+          <w:szCs w:val="24"/>
+          <w:lang w:val="en-US" w:bidi="he-IL"/>
         </w:rPr>
         <w:t xml:space="preserve">Humanities, 9</w:t>
       </w:r>
       <w:r>
         <w:rPr>
           <w:rFonts w:ascii="David" w:cs="David" w:eastAsia="David" w:hAnsi="David"/>
-          <w:sz w:val="24"/>
-          <w:szCs w:val="24"/>
+          <w:noProof/>
+          <w:sz w:val="24"/>
+          <w:szCs w:val="24"/>
+          <w:lang w:val="en-US" w:bidi="he-IL"/>
         </w:rPr>
         <w:t xml:space="preserve">(4), Article 137. </w:t>
       </w:r>
-      <w:hyperlink w:history="1" r:id="rIdcn-taoud_gkuzmq2l4m6q">
+      <w:hyperlink w:history="1" r:id="rIdifq2gxiu2_fgdg2jey3dn">
         <w:r>
           <w:rPr>
             <w:rFonts w:ascii="David" w:cs="David" w:eastAsia="David" w:hAnsi="David"/>
+            <w:noProof/>
             <w:color w:val="0563C1"/>
             <w:sz w:val="24"/>
             <w:szCs w:val="24"/>
@@ -623,8 +704,10 @@
       <w:r>
         <w:rPr>
           <w:rFonts w:ascii="David" w:cs="David" w:eastAsia="David" w:hAnsi="David"/>
-          <w:sz w:val="24"/>
-          <w:szCs w:val="24"/>
+          <w:noProof/>
+          <w:sz w:val="24"/>
+          <w:szCs w:val="24"/>
+          <w:lang w:val="en-US" w:bidi="he-IL"/>
         </w:rPr>
         <w:t xml:space="preserve">Rubin, S. S. (1999). The two-track model of bereavement: Overview, retrospect, and prospect. </w:t>
       </w:r>
@@ -633,23 +716,28 @@
           <w:rFonts w:ascii="David" w:cs="David" w:eastAsia="David" w:hAnsi="David"/>
           <w:i/>
           <w:iCs/>
-          <w:sz w:val="24"/>
-          <w:szCs w:val="24"/>
+          <w:noProof/>
+          <w:sz w:val="24"/>
+          <w:szCs w:val="24"/>
+          <w:lang w:val="en-US" w:bidi="he-IL"/>
         </w:rPr>
         <w:t xml:space="preserve">Death Studies, 23</w:t>
       </w:r>
       <w:r>
         <w:rPr>
           <w:rFonts w:ascii="David" w:cs="David" w:eastAsia="David" w:hAnsi="David"/>
-          <w:sz w:val="24"/>
-          <w:szCs w:val="24"/>
+          <w:noProof/>
+          <w:sz w:val="24"/>
+          <w:szCs w:val="24"/>
+          <w:lang w:val="en-US" w:bidi="he-IL"/>
         </w:rPr>
         <w:t xml:space="preserve">(8), 681-714. </w:t>
       </w:r>
-      <w:hyperlink w:history="1" r:id="rIdr4gwtpey-lrjdc-gb-deb">
+      <w:hyperlink w:history="1" r:id="rIdpstzbp29r3n1kic99oy1d">
         <w:r>
           <w:rPr>
             <w:rFonts w:ascii="David" w:cs="David" w:eastAsia="David" w:hAnsi="David"/>
+            <w:noProof/>
             <w:color w:val="0563C1"/>
             <w:sz w:val="24"/>
             <w:szCs w:val="24"/>
@@ -668,8 +756,10 @@
       <w:r>
         <w:rPr>
           <w:rFonts w:ascii="David" w:cs="David" w:eastAsia="David" w:hAnsi="David"/>
-          <w:sz w:val="24"/>
-          <w:szCs w:val="24"/>
+          <w:noProof/>
+          <w:sz w:val="24"/>
+          <w:szCs w:val="24"/>
+          <w:lang w:val="en-US" w:bidi="he-IL"/>
         </w:rPr>
         <w:t xml:space="preserve">Schwartz, Y. (2018). "A story or a bullet between the eyes": Etgar Keret: Repetitiveness, morality, and postmodernism. </w:t>
       </w:r>
@@ -678,23 +768,28 @@
           <w:rFonts w:ascii="David" w:cs="David" w:eastAsia="David" w:hAnsi="David"/>
           <w:i/>
           <w:iCs/>
-          <w:sz w:val="24"/>
-          <w:szCs w:val="24"/>
+          <w:noProof/>
+          <w:sz w:val="24"/>
+          <w:szCs w:val="24"/>
+          <w:lang w:val="en-US" w:bidi="he-IL"/>
         </w:rPr>
         <w:t xml:space="preserve">BGU Review: A Journal of Israeli Culture</w:t>
       </w:r>
       <w:r>
         <w:rPr>
           <w:rFonts w:ascii="David" w:cs="David" w:eastAsia="David" w:hAnsi="David"/>
-          <w:sz w:val="24"/>
-          <w:szCs w:val="24"/>
+          <w:noProof/>
+          <w:sz w:val="24"/>
+          <w:szCs w:val="24"/>
+          <w:lang w:val="en-US" w:bidi="he-IL"/>
         </w:rPr>
         <w:t xml:space="preserve">, Winter 2018, 1-24. (Original work published 2017 in Hebrew Studies, 58, 425-443) </w:t>
       </w:r>
-      <w:hyperlink w:history="1" r:id="rIdkhgmd_y1ooybonw9yhkr2">
+      <w:hyperlink w:history="1" r:id="rIdgkpewd5cbjzlh1yovh6sc">
         <w:r>
           <w:rPr>
             <w:rFonts w:ascii="David" w:cs="David" w:eastAsia="David" w:hAnsi="David"/>
+            <w:noProof/>
             <w:color w:val="0563C1"/>
             <w:sz w:val="24"/>
             <w:szCs w:val="24"/>
@@ -720,9 +815,11 @@
           <w:rFonts w:ascii="David" w:cs="David" w:eastAsia="David" w:hAnsi="David"/>
           <w:b/>
           <w:bCs/>
+          <w:noProof/>
           <w:sz w:val="30"/>
           <w:szCs w:val="30"/>
           <w:rtl/>
+          <w:lang w:val="en-US" w:bidi="he-IL"/>
         </w:rPr>
         <w:t xml:space="preserve">ראשי פרקים</w:t>
       </w:r>
@@ -738,9 +835,11 @@
           <w:rFonts w:ascii="David" w:cs="David" w:eastAsia="David" w:hAnsi="David"/>
           <w:b/>
           <w:bCs/>
-          <w:sz w:val="24"/>
-          <w:szCs w:val="24"/>
-          <w:rtl/>
+          <w:noProof/>
+          <w:sz w:val="24"/>
+          <w:szCs w:val="24"/>
+          <w:rtl/>
+          <w:lang w:val="en-US" w:bidi="he-IL"/>
         </w:rPr>
         <w:t xml:space="preserve">תקציר ומילות מפתח</w:t>
       </w:r>
@@ -755,9 +854,11 @@
       <w:r>
         <w:rPr>
           <w:rFonts w:ascii="David" w:cs="David" w:eastAsia="David" w:hAnsi="David"/>
-          <w:sz w:val="24"/>
-          <w:szCs w:val="24"/>
-          <w:rtl/>
+          <w:noProof/>
+          <w:sz w:val="24"/>
+          <w:szCs w:val="24"/>
+          <w:rtl/>
+          <w:lang w:val="en-US" w:bidi="he-IL"/>
         </w:rPr>
         <w:t xml:space="preserve">תמצית העבודה: הנושא, שני הסיפורים, שאלות המחקר, שיטת הניתוח והממצא המרכזי.</w:t>
       </w:r>
@@ -772,9 +873,11 @@
       <w:r>
         <w:rPr>
           <w:rFonts w:ascii="David" w:cs="David" w:eastAsia="David" w:hAnsi="David"/>
-          <w:sz w:val="24"/>
-          <w:szCs w:val="24"/>
-          <w:rtl/>
+          <w:noProof/>
+          <w:sz w:val="24"/>
+          <w:szCs w:val="24"/>
+          <w:rtl/>
+          <w:lang w:val="en-US" w:bidi="he-IL"/>
         </w:rPr>
         <w:t xml:space="preserve">מילות מפתח: אתגר קרת; הסיפור הקצר; התמודדות; אובדן ושכול; יחסי אב ובן; אשמה; פנטזיה; הומור; הדור השני.</w:t>
       </w:r>
@@ -790,9 +893,11 @@
           <w:rFonts w:ascii="David" w:cs="David" w:eastAsia="David" w:hAnsi="David"/>
           <w:b/>
           <w:bCs/>
-          <w:sz w:val="24"/>
-          <w:szCs w:val="24"/>
-          <w:rtl/>
+          <w:noProof/>
+          <w:sz w:val="24"/>
+          <w:szCs w:val="24"/>
+          <w:rtl/>
+          <w:lang w:val="en-US" w:bidi="he-IL"/>
         </w:rPr>
         <w:t xml:space="preserve">מבוא</w:t>
       </w:r>
@@ -807,9 +912,11 @@
       <w:r>
         <w:rPr>
           <w:rFonts w:ascii="David" w:cs="David" w:eastAsia="David" w:hAnsi="David"/>
-          <w:sz w:val="24"/>
-          <w:szCs w:val="24"/>
-          <w:rtl/>
+          <w:noProof/>
+          <w:sz w:val="24"/>
+          <w:szCs w:val="24"/>
+          <w:rtl/>
+          <w:lang w:val="en-US" w:bidi="he-IL"/>
         </w:rPr>
         <w:t xml:space="preserve">הסיפור העברי הקצר ומקומו בספרות הישראלית של שנות התשעים.</w:t>
       </w:r>
@@ -824,9 +931,11 @@
       <w:r>
         <w:rPr>
           <w:rFonts w:ascii="David" w:cs="David" w:eastAsia="David" w:hAnsi="David"/>
-          <w:sz w:val="24"/>
-          <w:szCs w:val="24"/>
-          <w:rtl/>
+          <w:noProof/>
+          <w:sz w:val="24"/>
+          <w:szCs w:val="24"/>
+          <w:rtl/>
+          <w:lang w:val="en-US" w:bidi="he-IL"/>
         </w:rPr>
         <w:t xml:space="preserve">סגנון כתיבתו של אתגר קרת: שפה דיבורית, קוצר, פנטסטי בתוך יומיומי, הומור שחור וסיום פתוח.</w:t>
       </w:r>
@@ -841,9 +950,11 @@
       <w:r>
         <w:rPr>
           <w:rFonts w:ascii="David" w:cs="David" w:eastAsia="David" w:hAnsi="David"/>
-          <w:sz w:val="24"/>
-          <w:szCs w:val="24"/>
-          <w:rtl/>
+          <w:noProof/>
+          <w:sz w:val="24"/>
+          <w:szCs w:val="24"/>
+          <w:rtl/>
+          <w:lang w:val="en-US" w:bidi="he-IL"/>
         </w:rPr>
         <w:t xml:space="preserve">הצגת הסיפורים: "האנשים החלולים" (געגועי לקיסינג'ר, 1994) ו"מי כמונו יודע" (אוטוקורקט, 2024).</w:t>
       </w:r>
@@ -858,9 +969,11 @@
       <w:r>
         <w:rPr>
           <w:rFonts w:ascii="David" w:cs="David" w:eastAsia="David" w:hAnsi="David"/>
-          <w:sz w:val="24"/>
-          <w:szCs w:val="24"/>
-          <w:rtl/>
+          <w:noProof/>
+          <w:sz w:val="24"/>
+          <w:szCs w:val="24"/>
+          <w:rtl/>
+          <w:lang w:val="en-US" w:bidi="he-IL"/>
         </w:rPr>
         <w:t xml:space="preserve">הנושא המשותף: דרכי התמודדות עם קשיים, ובתוכן יחסי אב ובן, אשמה וחרטה.</w:t>
       </w:r>
@@ -875,9 +988,11 @@
       <w:r>
         <w:rPr>
           <w:rFonts w:ascii="David" w:cs="David" w:eastAsia="David" w:hAnsi="David"/>
-          <w:sz w:val="24"/>
-          <w:szCs w:val="24"/>
-          <w:rtl/>
+          <w:noProof/>
+          <w:sz w:val="24"/>
+          <w:szCs w:val="24"/>
+          <w:rtl/>
+          <w:lang w:val="en-US" w:bidi="he-IL"/>
         </w:rPr>
         <w:t xml:space="preserve">שאלות המחקר:</w:t>
       </w:r>
@@ -892,9 +1007,11 @@
       <w:r>
         <w:rPr>
           <w:rFonts w:ascii="David" w:cs="David" w:eastAsia="David" w:hAnsi="David"/>
-          <w:sz w:val="24"/>
-          <w:szCs w:val="24"/>
-          <w:rtl/>
+          <w:noProof/>
+          <w:sz w:val="24"/>
+          <w:szCs w:val="24"/>
+          <w:rtl/>
+          <w:lang w:val="en-US" w:bidi="he-IL"/>
         </w:rPr>
         <w:t xml:space="preserve">א. אילו קשיים ניצבים בפני הדמויות בשני הסיפורים, ואילו דרכי התמודדות הן נוקטות?</w:t>
       </w:r>
@@ -909,9 +1026,11 @@
       <w:r>
         <w:rPr>
           <w:rFonts w:ascii="David" w:cs="David" w:eastAsia="David" w:hAnsi="David"/>
-          <w:sz w:val="24"/>
-          <w:szCs w:val="24"/>
-          <w:rtl/>
+          <w:noProof/>
+          <w:sz w:val="24"/>
+          <w:szCs w:val="24"/>
+          <w:rtl/>
+          <w:lang w:val="en-US" w:bidi="he-IL"/>
         </w:rPr>
         <w:t xml:space="preserve">ב. כיצד משמשים השפה, הפנטזיה וההומור כאמצעי התמודדות, אצל הדמויות ואצל המספר?</w:t>
       </w:r>
@@ -926,9 +1045,11 @@
       <w:r>
         <w:rPr>
           <w:rFonts w:ascii="David" w:cs="David" w:eastAsia="David" w:hAnsi="David"/>
-          <w:sz w:val="24"/>
-          <w:szCs w:val="24"/>
-          <w:rtl/>
+          <w:noProof/>
+          <w:sz w:val="24"/>
+          <w:szCs w:val="24"/>
+          <w:rtl/>
+          <w:lang w:val="en-US" w:bidi="he-IL"/>
         </w:rPr>
         <w:t xml:space="preserve">ג. מה תפקידו של האחר (האב; הזר בבית הקפה) בהתמודדות, ומה מחירה של ההתמודדות?</w:t>
       </w:r>
@@ -943,9 +1064,11 @@
       <w:r>
         <w:rPr>
           <w:rFonts w:ascii="David" w:cs="David" w:eastAsia="David" w:hAnsi="David"/>
-          <w:sz w:val="24"/>
-          <w:szCs w:val="24"/>
-          <w:rtl/>
+          <w:noProof/>
+          <w:sz w:val="24"/>
+          <w:szCs w:val="24"/>
+          <w:rtl/>
+          <w:lang w:val="en-US" w:bidi="he-IL"/>
         </w:rPr>
         <w:t xml:space="preserve">מבנה העבודה.</w:t>
       </w:r>
@@ -961,9 +1084,11 @@
           <w:rFonts w:ascii="David" w:cs="David" w:eastAsia="David" w:hAnsi="David"/>
           <w:b/>
           <w:bCs/>
-          <w:sz w:val="24"/>
-          <w:szCs w:val="24"/>
-          <w:rtl/>
+          <w:noProof/>
+          <w:sz w:val="24"/>
+          <w:szCs w:val="24"/>
+          <w:rtl/>
+          <w:lang w:val="en-US" w:bidi="he-IL"/>
         </w:rPr>
         <w:t xml:space="preserve">פרק 1: רקע תאורטי</w:t>
       </w:r>
@@ -978,9 +1103,11 @@
       <w:r>
         <w:rPr>
           <w:rFonts w:ascii="David" w:cs="David" w:eastAsia="David" w:hAnsi="David"/>
-          <w:sz w:val="24"/>
-          <w:szCs w:val="24"/>
-          <w:rtl/>
+          <w:noProof/>
+          <w:sz w:val="24"/>
+          <w:szCs w:val="24"/>
+          <w:rtl/>
+          <w:lang w:val="en-US" w:bidi="he-IL"/>
         </w:rPr>
         <w:t xml:space="preserve">1.1 התמודדות עם לחץ וקשיים: הערכה ראשונית ומשנית, התמודדות ממוקדת בעיה, ממוקדת רגש והימנעות (Lazarus &amp; Folkman, 1984).</w:t>
       </w:r>
@@ -995,9 +1122,11 @@
       <w:r>
         <w:rPr>
           <w:rFonts w:ascii="David" w:cs="David" w:eastAsia="David" w:hAnsi="David"/>
-          <w:sz w:val="24"/>
-          <w:szCs w:val="24"/>
-          <w:rtl/>
+          <w:noProof/>
+          <w:sz w:val="24"/>
+          <w:szCs w:val="24"/>
+          <w:rtl/>
+          <w:lang w:val="en-US" w:bidi="he-IL"/>
         </w:rPr>
         <w:t xml:space="preserve">1.2 אובדן ושכול: המודל הדו-מסלולי (Rubin, 1999); אבל במשפחה אחרי מות ילד (כהן, 2015).</w:t>
       </w:r>
@@ -1012,9 +1141,11 @@
       <w:r>
         <w:rPr>
           <w:rFonts w:ascii="David" w:cs="David" w:eastAsia="David" w:hAnsi="David"/>
-          <w:sz w:val="24"/>
-          <w:szCs w:val="24"/>
-          <w:rtl/>
+          <w:noProof/>
+          <w:sz w:val="24"/>
+          <w:szCs w:val="24"/>
+          <w:rtl/>
+          <w:lang w:val="en-US" w:bidi="he-IL"/>
         </w:rPr>
         <w:t xml:space="preserve">1.3 הורשה בין-דורית: יחסי אב ובן, אשמה וזיכרון בקרב הדור השני והשלישי (Omer-Sherman, 2020; Abramovich, 2019).</w:t>
       </w:r>
@@ -1029,9 +1160,11 @@
       <w:r>
         <w:rPr>
           <w:rFonts w:ascii="David" w:cs="David" w:eastAsia="David" w:hAnsi="David"/>
-          <w:sz w:val="24"/>
-          <w:szCs w:val="24"/>
-          <w:rtl/>
+          <w:noProof/>
+          <w:sz w:val="24"/>
+          <w:szCs w:val="24"/>
+          <w:rtl/>
+          <w:lang w:val="en-US" w:bidi="he-IL"/>
         </w:rPr>
         <w:t xml:space="preserve">1.4 הפואטיקה של קרת ככלי התמודדות: מיתוס כ"הרמוניה ללא סדר" והקול הגנוב (כצמן, 2005); המתים-החיים והגבריות החלשה (Mendelson-Maoz, 2018); חזרה מכנית ומוטציה נרטיבית (Schwartz, 2018).</w:t>
       </w:r>
@@ -1047,9 +1180,11 @@
           <w:rFonts w:ascii="David" w:cs="David" w:eastAsia="David" w:hAnsi="David"/>
           <w:b/>
           <w:bCs/>
-          <w:sz w:val="24"/>
-          <w:szCs w:val="24"/>
-          <w:rtl/>
+          <w:noProof/>
+          <w:sz w:val="24"/>
+          <w:szCs w:val="24"/>
+          <w:rtl/>
+          <w:lang w:val="en-US" w:bidi="he-IL"/>
         </w:rPr>
         <w:t xml:space="preserve">פרק 2: "האנשים החלולים": הסתגרות, לחישה ושתיקה כדרכי התמודדות</w:t>
       </w:r>
@@ -1064,9 +1199,11 @@
       <w:r>
         <w:rPr>
           <w:rFonts w:ascii="David" w:cs="David" w:eastAsia="David" w:hAnsi="David"/>
-          <w:sz w:val="24"/>
-          <w:szCs w:val="24"/>
-          <w:rtl/>
+          <w:noProof/>
+          <w:sz w:val="24"/>
+          <w:szCs w:val="24"/>
+          <w:rtl/>
+          <w:lang w:val="en-US" w:bidi="he-IL"/>
         </w:rPr>
         <w:t xml:space="preserve">2.1 תקציר הסיפור ומבנהו: מספר ילד, בית סגור, קולות בדלת, מות האם ומות האב.</w:t>
       </w:r>
@@ -1081,9 +1218,11 @@
       <w:r>
         <w:rPr>
           <w:rFonts w:ascii="David" w:cs="David" w:eastAsia="David" w:hAnsi="David"/>
-          <w:sz w:val="24"/>
-          <w:szCs w:val="24"/>
-          <w:rtl/>
+          <w:noProof/>
+          <w:sz w:val="24"/>
+          <w:szCs w:val="24"/>
+          <w:rtl/>
+          <w:lang w:val="en-US" w:bidi="he-IL"/>
         </w:rPr>
         <w:t xml:space="preserve">2.2 הקושי: פחד, פלישה ובדידות.</w:t>
       </w:r>
@@ -1098,9 +1237,11 @@
       <w:r>
         <w:rPr>
           <w:rFonts w:ascii="David" w:cs="David" w:eastAsia="David" w:hAnsi="David"/>
-          <w:sz w:val="24"/>
-          <w:szCs w:val="24"/>
-          <w:rtl/>
+          <w:noProof/>
+          <w:sz w:val="24"/>
+          <w:szCs w:val="24"/>
+          <w:rtl/>
+          <w:lang w:val="en-US" w:bidi="he-IL"/>
         </w:rPr>
         <w:t xml:space="preserve">2.3 דרכי ההתמודדות של האב: הימנעות (הדלת והתריסים), הסבר מחדש ("סתם קולות"), מגע ולחישה.</w:t>
       </w:r>
@@ -1115,9 +1256,11 @@
       <w:r>
         <w:rPr>
           <w:rFonts w:ascii="David" w:cs="David" w:eastAsia="David" w:hAnsi="David"/>
-          <w:sz w:val="24"/>
-          <w:szCs w:val="24"/>
-          <w:rtl/>
+          <w:noProof/>
+          <w:sz w:val="24"/>
+          <w:szCs w:val="24"/>
+          <w:rtl/>
+          <w:lang w:val="en-US" w:bidi="he-IL"/>
         </w:rPr>
         <w:t xml:space="preserve">2.4 יחסי אב ובן: הורשת הפחד והורשת ההתמודדות; הבן לומד לומר את המילים במקום האב.</w:t>
       </w:r>
@@ -1132,9 +1275,11 @@
       <w:r>
         <w:rPr>
           <w:rFonts w:ascii="David" w:cs="David" w:eastAsia="David" w:hAnsi="David"/>
-          <w:sz w:val="24"/>
-          <w:szCs w:val="24"/>
-          <w:rtl/>
+          <w:noProof/>
+          <w:sz w:val="24"/>
+          <w:szCs w:val="24"/>
+          <w:rtl/>
+          <w:lang w:val="en-US" w:bidi="he-IL"/>
         </w:rPr>
         <w:t xml:space="preserve">2.5 התמודדות עם אובדן: מות האם "בלי קול אבל עם גוף" ומות האב ליד הפסנתר.</w:t>
       </w:r>
@@ -1149,9 +1294,11 @@
       <w:r>
         <w:rPr>
           <w:rFonts w:ascii="David" w:cs="David" w:eastAsia="David" w:hAnsi="David"/>
-          <w:sz w:val="24"/>
-          <w:szCs w:val="24"/>
-          <w:rtl/>
+          <w:noProof/>
+          <w:sz w:val="24"/>
+          <w:szCs w:val="24"/>
+          <w:rtl/>
+          <w:lang w:val="en-US" w:bidi="he-IL"/>
         </w:rPr>
         <w:t xml:space="preserve">2.6 מחיר ההתמודדות: "סתם, ממש סתם"; הקול הגנוב; הבן שנעשה אחד מהאנשים החלולים.</w:t>
       </w:r>
@@ -1167,9 +1314,11 @@
           <w:rFonts w:ascii="David" w:cs="David" w:eastAsia="David" w:hAnsi="David"/>
           <w:b/>
           <w:bCs/>
-          <w:sz w:val="24"/>
-          <w:szCs w:val="24"/>
-          <w:rtl/>
+          <w:noProof/>
+          <w:sz w:val="24"/>
+          <w:szCs w:val="24"/>
+          <w:rtl/>
+          <w:lang w:val="en-US" w:bidi="he-IL"/>
         </w:rPr>
         <w:t xml:space="preserve">פרק 3: "מי כמונו יודע": דיבור, אידאולוגיה, הסתרה וכתיבה כדרכי התמודדות</w:t>
       </w:r>
@@ -1184,9 +1333,11 @@
       <w:r>
         <w:rPr>
           <w:rFonts w:ascii="David" w:cs="David" w:eastAsia="David" w:hAnsi="David"/>
-          <w:sz w:val="24"/>
-          <w:szCs w:val="24"/>
-          <w:rtl/>
+          <w:noProof/>
+          <w:sz w:val="24"/>
+          <w:szCs w:val="24"/>
+          <w:rtl/>
+          <w:lang w:val="en-US" w:bidi="he-IL"/>
         </w:rPr>
         <w:t xml:space="preserve">3.1 תקציר הסיפור ומבנהו: הסופר האמריקאי, חייו שהתפרקו, התחתונים, השקיעה והצוואר.</w:t>
       </w:r>
@@ -1201,9 +1352,11 @@
       <w:r>
         <w:rPr>
           <w:rFonts w:ascii="David" w:cs="David" w:eastAsia="David" w:hAnsi="David"/>
-          <w:sz w:val="24"/>
-          <w:szCs w:val="24"/>
-          <w:rtl/>
+          <w:noProof/>
+          <w:sz w:val="24"/>
+          <w:szCs w:val="24"/>
+          <w:rtl/>
+          <w:lang w:val="en-US" w:bidi="he-IL"/>
         </w:rPr>
         <w:t xml:space="preserve">3.2 הקושי: אובדן ילד, פירוק משפחה ובדידות אצל הזר; מבוכה וצורך בשייכות אצל המספר.</w:t>
       </w:r>
@@ -1218,9 +1371,11 @@
       <w:r>
         <w:rPr>
           <w:rFonts w:ascii="David" w:cs="David" w:eastAsia="David" w:hAnsi="David"/>
-          <w:sz w:val="24"/>
-          <w:szCs w:val="24"/>
-          <w:rtl/>
+          <w:noProof/>
+          <w:sz w:val="24"/>
+          <w:szCs w:val="24"/>
+          <w:rtl/>
+          <w:lang w:val="en-US" w:bidi="he-IL"/>
         </w:rPr>
         <w:t xml:space="preserve">3.3 "ומי כמונו יודע": השפה כחיפוש שייכות; "תאומים סיאמיים" עם לב אחד כואב.</w:t>
       </w:r>
@@ -1235,9 +1390,11 @@
       <w:r>
         <w:rPr>
           <w:rFonts w:ascii="David" w:cs="David" w:eastAsia="David" w:hAnsi="David"/>
-          <w:sz w:val="24"/>
-          <w:szCs w:val="24"/>
-          <w:rtl/>
+          <w:noProof/>
+          <w:sz w:val="24"/>
+          <w:szCs w:val="24"/>
+          <w:rtl/>
+          <w:lang w:val="en-US" w:bidi="he-IL"/>
         </w:rPr>
         <w:t xml:space="preserve">3.4 מינימליזם והחלפת אמונות: בנייה מחדש של החיים אחרי אובדן, פתרון לכאורה והימנעות למעשה.</w:t>
       </w:r>
@@ -1252,9 +1409,11 @@
       <w:r>
         <w:rPr>
           <w:rFonts w:ascii="David" w:cs="David" w:eastAsia="David" w:hAnsi="David"/>
-          <w:sz w:val="24"/>
-          <w:szCs w:val="24"/>
-          <w:rtl/>
+          <w:noProof/>
+          <w:sz w:val="24"/>
+          <w:szCs w:val="24"/>
+          <w:rtl/>
+          <w:lang w:val="en-US" w:bidi="he-IL"/>
         </w:rPr>
         <w:t xml:space="preserve">3.5 הסתרה והסכמה: התחתונים והשקיעה; שמירה על הקשר במחיר של ויתור על העצמי.</w:t>
       </w:r>
@@ -1269,9 +1428,11 @@
       <w:r>
         <w:rPr>
           <w:rFonts w:ascii="David" w:cs="David" w:eastAsia="David" w:hAnsi="David"/>
-          <w:sz w:val="24"/>
-          <w:szCs w:val="24"/>
-          <w:rtl/>
+          <w:noProof/>
+          <w:sz w:val="24"/>
+          <w:szCs w:val="24"/>
+          <w:rtl/>
+          <w:lang w:val="en-US" w:bidi="he-IL"/>
         </w:rPr>
         <w:t xml:space="preserve">3.6 הכתיבה: "פעולת הסחה" או שימור היופי לנצח; עמדה מטא-פואטית.</w:t>
       </w:r>
@@ -1286,9 +1447,11 @@
       <w:r>
         <w:rPr>
           <w:rFonts w:ascii="David" w:cs="David" w:eastAsia="David" w:hAnsi="David"/>
-          <w:sz w:val="24"/>
-          <w:szCs w:val="24"/>
-          <w:rtl/>
+          <w:noProof/>
+          <w:sz w:val="24"/>
+          <w:szCs w:val="24"/>
+          <w:rtl/>
+          <w:lang w:val="en-US" w:bidi="he-IL"/>
         </w:rPr>
         <w:t xml:space="preserve">3.7 הסיום: הצוואר במקום השקיעה; המוטציה שעוצרת את לולאת החזרות.</w:t>
       </w:r>
@@ -1304,9 +1467,11 @@
           <w:rFonts w:ascii="David" w:cs="David" w:eastAsia="David" w:hAnsi="David"/>
           <w:b/>
           <w:bCs/>
-          <w:sz w:val="24"/>
-          <w:szCs w:val="24"/>
-          <w:rtl/>
+          <w:noProof/>
+          <w:sz w:val="24"/>
+          <w:szCs w:val="24"/>
+          <w:rtl/>
+          <w:lang w:val="en-US" w:bidi="he-IL"/>
         </w:rPr>
         <w:t xml:space="preserve">פרק 4: השוואה בין הסיפורים</w:t>
       </w:r>
@@ -1321,9 +1486,11 @@
       <w:r>
         <w:rPr>
           <w:rFonts w:ascii="David" w:cs="David" w:eastAsia="David" w:hAnsi="David"/>
-          <w:sz w:val="24"/>
-          <w:szCs w:val="24"/>
-          <w:rtl/>
+          <w:noProof/>
+          <w:sz w:val="24"/>
+          <w:szCs w:val="24"/>
+          <w:rtl/>
+          <w:lang w:val="en-US" w:bidi="he-IL"/>
         </w:rPr>
         <w:t xml:space="preserve">4.1 הדמיון: הפנטזיה והשפה כדרך לחיות עם הקושי בלי לפתור אותו.</w:t>
       </w:r>
@@ -1338,9 +1505,11 @@
       <w:r>
         <w:rPr>
           <w:rFonts w:ascii="David" w:cs="David" w:eastAsia="David" w:hAnsi="David"/>
-          <w:sz w:val="24"/>
-          <w:szCs w:val="24"/>
-          <w:rtl/>
+          <w:noProof/>
+          <w:sz w:val="24"/>
+          <w:szCs w:val="24"/>
+          <w:rtl/>
+          <w:lang w:val="en-US" w:bidi="he-IL"/>
         </w:rPr>
         <w:t xml:space="preserve">4.2 השוני: שתיקה מול דיבור; הסתגרות מול חיבור; ילד מול מבוגר.</w:t>
       </w:r>
@@ -1355,9 +1524,11 @@
       <w:r>
         <w:rPr>
           <w:rFonts w:ascii="David" w:cs="David" w:eastAsia="David" w:hAnsi="David"/>
-          <w:sz w:val="24"/>
-          <w:szCs w:val="24"/>
-          <w:rtl/>
+          <w:noProof/>
+          <w:sz w:val="24"/>
+          <w:szCs w:val="24"/>
+          <w:rtl/>
+          <w:lang w:val="en-US" w:bidi="he-IL"/>
         </w:rPr>
         <w:t xml:space="preserve">4.3 המספר בגוף ראשון: הילד ששותק והמבוגר שמהנהן.</w:t>
       </w:r>
@@ -1372,9 +1543,11 @@
       <w:r>
         <w:rPr>
           <w:rFonts w:ascii="David" w:cs="David" w:eastAsia="David" w:hAnsi="David"/>
-          <w:sz w:val="24"/>
-          <w:szCs w:val="24"/>
-          <w:rtl/>
+          <w:noProof/>
+          <w:sz w:val="24"/>
+          <w:szCs w:val="24"/>
+          <w:rtl/>
+          <w:lang w:val="en-US" w:bidi="he-IL"/>
         </w:rPr>
         <w:t xml:space="preserve">4.4 מן הסיפור המוקדם למאוחר: מ"סתם קולות" אל "סתם צוואר"; הכתיבה נעשית דרך ההתמודדות.</w:t>
       </w:r>
@@ -1390,9 +1563,11 @@
           <w:rFonts w:ascii="David" w:cs="David" w:eastAsia="David" w:hAnsi="David"/>
           <w:b/>
           <w:bCs/>
-          <w:sz w:val="24"/>
-          <w:szCs w:val="24"/>
-          <w:rtl/>
+          <w:noProof/>
+          <w:sz w:val="24"/>
+          <w:szCs w:val="24"/>
+          <w:rtl/>
+          <w:lang w:val="en-US" w:bidi="he-IL"/>
         </w:rPr>
         <w:t xml:space="preserve">דיון</w:t>
       </w:r>
@@ -1407,9 +1582,11 @@
       <w:r>
         <w:rPr>
           <w:rFonts w:ascii="David" w:cs="David" w:eastAsia="David" w:hAnsi="David"/>
-          <w:sz w:val="24"/>
-          <w:szCs w:val="24"/>
-          <w:rtl/>
+          <w:noProof/>
+          <w:sz w:val="24"/>
+          <w:szCs w:val="24"/>
+          <w:rtl/>
+          <w:lang w:val="en-US" w:bidi="he-IL"/>
         </w:rPr>
         <w:t xml:space="preserve">קריאת הממצאים לאור המודלים התאורטיים: התמודדות ממוקדת רגש והימנעות; הערכה מחודשת של המציאות באמצעות שפה ודמיון; ההקשר הבין-דורי והתרבותי; מגבלות המחקר.</w:t>
       </w:r>
@@ -1425,9 +1602,11 @@
           <w:rFonts w:ascii="David" w:cs="David" w:eastAsia="David" w:hAnsi="David"/>
           <w:b/>
           <w:bCs/>
-          <w:sz w:val="24"/>
-          <w:szCs w:val="24"/>
-          <w:rtl/>
+          <w:noProof/>
+          <w:sz w:val="24"/>
+          <w:szCs w:val="24"/>
+          <w:rtl/>
+          <w:lang w:val="en-US" w:bidi="he-IL"/>
         </w:rPr>
         <w:t xml:space="preserve">סיכום ומסקנות</w:t>
       </w:r>
@@ -1442,9 +1621,11 @@
       <w:r>
         <w:rPr>
           <w:rFonts w:ascii="David" w:cs="David" w:eastAsia="David" w:hAnsi="David"/>
-          <w:sz w:val="24"/>
-          <w:szCs w:val="24"/>
-          <w:rtl/>
+          <w:noProof/>
+          <w:sz w:val="24"/>
+          <w:szCs w:val="24"/>
+          <w:rtl/>
+          <w:lang w:val="en-US" w:bidi="he-IL"/>
         </w:rPr>
         <w:t xml:space="preserve">מענה לשאלות המחקר; המסקנה המרכזית והמלצות יישומיות להוראת הסיפורים.</w:t>
       </w:r>
@@ -1460,9 +1641,11 @@
           <w:rFonts w:ascii="David" w:cs="David" w:eastAsia="David" w:hAnsi="David"/>
           <w:b/>
           <w:bCs/>
-          <w:sz w:val="24"/>
-          <w:szCs w:val="24"/>
-          <w:rtl/>
+          <w:noProof/>
+          <w:sz w:val="24"/>
+          <w:szCs w:val="24"/>
+          <w:rtl/>
+          <w:lang w:val="en-US" w:bidi="he-IL"/>
         </w:rPr>
         <w:t xml:space="preserve">רשימת מקורות</w:t>
       </w:r>
@@ -1478,9 +1661,11 @@
           <w:rFonts w:ascii="David" w:cs="David" w:eastAsia="David" w:hAnsi="David"/>
           <w:b/>
           <w:bCs/>
-          <w:sz w:val="24"/>
-          <w:szCs w:val="24"/>
-          <w:rtl/>
+          <w:noProof/>
+          <w:sz w:val="24"/>
+          <w:szCs w:val="24"/>
+          <w:rtl/>
+          <w:lang w:val="en-US" w:bidi="he-IL"/>
         </w:rPr>
         <w:t xml:space="preserve">רפלקציה</w:t>
       </w:r>
@@ -1495,9 +1680,11 @@
       <w:r>
         <w:rPr>
           <w:rFonts w:ascii="David" w:cs="David" w:eastAsia="David" w:hAnsi="David"/>
-          <w:sz w:val="24"/>
-          <w:szCs w:val="24"/>
-          <w:rtl/>
+          <w:noProof/>
+          <w:sz w:val="24"/>
+          <w:szCs w:val="24"/>
+          <w:rtl/>
+          <w:lang w:val="en-US" w:bidi="he-IL"/>
         </w:rPr>
         <w:t xml:space="preserve">תיאור תהליך העבודה: בחירת הסיפורים והנושא, איתור המקורות, קשיים ותובנות.</w:t>
       </w:r>
@@ -1513,9 +1700,11 @@
           <w:rFonts w:ascii="David" w:cs="David" w:eastAsia="David" w:hAnsi="David"/>
           <w:b/>
           <w:bCs/>
-          <w:sz w:val="24"/>
-          <w:szCs w:val="24"/>
-          <w:rtl/>
+          <w:noProof/>
+          <w:sz w:val="24"/>
+          <w:szCs w:val="24"/>
+          <w:rtl/>
+          <w:lang w:val="en-US" w:bidi="he-IL"/>
         </w:rPr>
         <w:t xml:space="preserve">נספחים</w:t>
       </w:r>
@@ -1530,9 +1719,11 @@
       <w:r>
         <w:rPr>
           <w:rFonts w:ascii="David" w:cs="David" w:eastAsia="David" w:hAnsi="David"/>
-          <w:sz w:val="24"/>
-          <w:szCs w:val="24"/>
-          <w:rtl/>
+          <w:noProof/>
+          <w:sz w:val="24"/>
+          <w:szCs w:val="24"/>
+          <w:rtl/>
+          <w:lang w:val="en-US" w:bidi="he-IL"/>
         </w:rPr>
         <w:t xml:space="preserve">נספח א: "האנשים החלולים" (סריקה). נספח ב: "מי כמונו יודע" (סריקה).</w:t>
       </w:r>
@@ -1750,9 +1941,11 @@
     <w:rPrDefault>
       <w:rPr>
         <w:rFonts w:ascii="David" w:cs="David" w:eastAsia="David" w:hAnsi="David"/>
+        <w:noProof/>
         <w:sz w:val="24"/>
         <w:szCs w:val="24"/>
         <w:rtl/>
+        <w:lang w:val="en-US" w:bidi="he-IL"/>
       </w:rPr>
     </w:rPrDefault>
     <w:pPrDefault>

</xml_diff>